<commit_message>
Fix Template 1,5 bulan
</commit_message>
<xml_diff>
--- a/public/templates/BERKAS PEMBAYARAN PPL TERMIN II - 1,5 BULAN (1).docx
+++ b/public/templates/BERKAS PEMBAYARAN PPL TERMIN II - 1,5 BULAN (1).docx
@@ -2565,27 +2565,7 @@
           <w:sz w:val="24"/>
           <w:szCs w:val="24"/>
         </w:rPr>
-        <w:t xml:space="preserve"> </w:t>
-      </w:r>
-      <w:proofErr w:type="gramStart"/>
-      <w:r>
-        <w:rPr>
-          <w:rFonts w:ascii="Bookman Old Style" w:eastAsia="Bookman Old Style" w:hAnsi="Bookman Old Style" w:cs="Bookman Old Style"/>
-          <w:color w:val="000000"/>
-          <w:sz w:val="24"/>
-          <w:szCs w:val="24"/>
-        </w:rPr>
-        <w:t>Lapangan  Sensus</w:t>
-      </w:r>
-      <w:proofErr w:type="gramEnd"/>
-      <w:r>
-        <w:rPr>
-          <w:rFonts w:ascii="Bookman Old Style" w:eastAsia="Bookman Old Style" w:hAnsi="Bookman Old Style" w:cs="Bookman Old Style"/>
-          <w:color w:val="000000"/>
-          <w:sz w:val="24"/>
-          <w:szCs w:val="24"/>
-        </w:rPr>
-        <w:t xml:space="preserve"> Ekonomi 2026 pada Badan Pusat </w:t>
+        <w:t xml:space="preserve"> Lapangan  Sensus Ekonomi 2026 pada Badan Pusat </w:t>
       </w:r>
       <w:proofErr w:type="spellStart"/>
       <w:r>
@@ -6559,23 +6539,7 @@
                 <w:rFonts w:ascii="Arial" w:eastAsia="Arial" w:hAnsi="Arial"/>
                 <w:sz w:val="16"/>
               </w:rPr>
-              <w:t>{#foto_</w:t>
-            </w:r>
-            <w:proofErr w:type="gramStart"/>
-            <w:r>
-              <w:rPr>
-                <w:rFonts w:ascii="Arial" w:eastAsia="Arial" w:hAnsi="Arial"/>
-                <w:sz w:val="16"/>
-              </w:rPr>
-              <w:t>rows}{</w:t>
-            </w:r>
-            <w:proofErr w:type="gramEnd"/>
-            <w:r>
-              <w:rPr>
-                <w:rFonts w:ascii="Arial" w:eastAsia="Arial" w:hAnsi="Arial"/>
-                <w:sz w:val="16"/>
-              </w:rPr>
-              <w:t>%foto1}</w:t>
+              <w:t>{#foto_rows}{%foto1}</w:t>
             </w:r>
           </w:p>
         </w:tc>
@@ -6625,23 +6589,7 @@
                 <w:rFonts w:ascii="Arial" w:eastAsia="Arial" w:hAnsi="Arial"/>
                 <w:sz w:val="16"/>
               </w:rPr>
-              <w:t>{%foto</w:t>
-            </w:r>
-            <w:proofErr w:type="gramStart"/>
-            <w:r>
-              <w:rPr>
-                <w:rFonts w:ascii="Arial" w:eastAsia="Arial" w:hAnsi="Arial"/>
-                <w:sz w:val="16"/>
-              </w:rPr>
-              <w:t>3}{</w:t>
-            </w:r>
-            <w:proofErr w:type="gramEnd"/>
-            <w:r>
-              <w:rPr>
-                <w:rFonts w:ascii="Arial" w:eastAsia="Arial" w:hAnsi="Arial"/>
-                <w:sz w:val="16"/>
-              </w:rPr>
-              <w:t>/</w:t>
+              <w:t>{%foto3}{/</w:t>
             </w:r>
             <w:proofErr w:type="spellStart"/>
             <w:r>
@@ -11993,27 +11941,7 @@
                 <w:szCs w:val="24"/>
                 <w:lang w:val="en"/>
               </w:rPr>
-              <w:t>{#</w:t>
-            </w:r>
-            <w:proofErr w:type="gramStart"/>
-            <w:r>
-              <w:rPr>
-                <w:rFonts w:ascii="Bookman Old Style" w:eastAsia="Bookman Old Style" w:hAnsi="Bookman Old Style" w:cs="Bookman Old Style"/>
-                <w:sz w:val="24"/>
-                <w:szCs w:val="24"/>
-                <w:lang w:val="en"/>
-              </w:rPr>
-              <w:t>peserta}{</w:t>
-            </w:r>
-            <w:proofErr w:type="gramEnd"/>
-            <w:r>
-              <w:rPr>
-                <w:rFonts w:ascii="Bookman Old Style" w:eastAsia="Bookman Old Style" w:hAnsi="Bookman Old Style" w:cs="Bookman Old Style"/>
-                <w:sz w:val="24"/>
-                <w:szCs w:val="24"/>
-                <w:lang w:val="en"/>
-              </w:rPr>
-              <w:t>no}</w:t>
+              <w:t>{#peserta}{no}</w:t>
             </w:r>
           </w:p>
         </w:tc>
@@ -12147,7 +12075,6 @@
               <w:t>jumlah</w:t>
             </w:r>
             <w:proofErr w:type="spellEnd"/>
-            <w:proofErr w:type="gramStart"/>
             <w:r>
               <w:rPr>
                 <w:rFonts w:ascii="Bookman Old Style" w:eastAsia="Bookman Old Style" w:hAnsi="Bookman Old Style" w:cs="Bookman Old Style"/>
@@ -12155,9 +12082,9 @@
                 <w:szCs w:val="24"/>
                 <w:lang w:val="en"/>
               </w:rPr>
-              <w:t>}{</w:t>
-            </w:r>
-            <w:proofErr w:type="gramEnd"/>
+              <w:t>}{/</w:t>
+            </w:r>
+            <w:proofErr w:type="spellStart"/>
             <w:r>
               <w:rPr>
                 <w:rFonts w:ascii="Bookman Old Style" w:eastAsia="Bookman Old Style" w:hAnsi="Bookman Old Style" w:cs="Bookman Old Style"/>
@@ -12165,9 +12092,9 @@
                 <w:szCs w:val="24"/>
                 <w:lang w:val="en"/>
               </w:rPr>
-              <w:t>/</w:t>
-            </w:r>
-            <w:proofErr w:type="spellStart"/>
+              <w:t>peserta</w:t>
+            </w:r>
+            <w:proofErr w:type="spellEnd"/>
             <w:r>
               <w:rPr>
                 <w:rFonts w:ascii="Bookman Old Style" w:eastAsia="Bookman Old Style" w:hAnsi="Bookman Old Style" w:cs="Bookman Old Style"/>
@@ -12175,9 +12102,8 @@
                 <w:szCs w:val="24"/>
                 <w:lang w:val="en"/>
               </w:rPr>
-              <w:t>peserta</w:t>
-            </w:r>
-            <w:proofErr w:type="spellEnd"/>
+              <w:t>}</w:t>
+            </w:r>
           </w:p>
         </w:tc>
       </w:tr>
@@ -12330,23 +12256,7 @@
                 <w:rFonts w:ascii="Arial" w:eastAsia="Arial" w:hAnsi="Arial"/>
                 <w:sz w:val="16"/>
               </w:rPr>
-              <w:t>{#foto_</w:t>
-            </w:r>
-            <w:proofErr w:type="gramStart"/>
-            <w:r>
-              <w:rPr>
-                <w:rFonts w:ascii="Arial" w:eastAsia="Arial" w:hAnsi="Arial"/>
-                <w:sz w:val="16"/>
-              </w:rPr>
-              <w:t>rows}{</w:t>
-            </w:r>
-            <w:proofErr w:type="gramEnd"/>
-            <w:r>
-              <w:rPr>
-                <w:rFonts w:ascii="Arial" w:eastAsia="Arial" w:hAnsi="Arial"/>
-                <w:sz w:val="16"/>
-              </w:rPr>
-              <w:t>%foto1}</w:t>
+              <w:t>{#foto_rows}{%foto1}</w:t>
             </w:r>
           </w:p>
         </w:tc>
@@ -12396,23 +12306,7 @@
                 <w:rFonts w:ascii="Arial" w:eastAsia="Arial" w:hAnsi="Arial"/>
                 <w:sz w:val="16"/>
               </w:rPr>
-              <w:t>{%foto</w:t>
-            </w:r>
-            <w:proofErr w:type="gramStart"/>
-            <w:r>
-              <w:rPr>
-                <w:rFonts w:ascii="Arial" w:eastAsia="Arial" w:hAnsi="Arial"/>
-                <w:sz w:val="16"/>
-              </w:rPr>
-              <w:t>3}{</w:t>
-            </w:r>
-            <w:proofErr w:type="gramEnd"/>
-            <w:r>
-              <w:rPr>
-                <w:rFonts w:ascii="Arial" w:eastAsia="Arial" w:hAnsi="Arial"/>
-                <w:sz w:val="16"/>
-              </w:rPr>
-              <w:t>/</w:t>
+              <w:t>{%foto3}{/</w:t>
             </w:r>
             <w:proofErr w:type="spellStart"/>
             <w:r>

</xml_diff>